<commit_message>
figure(p8): add inverted-U inversion figure (mainland ∩ vs SIDS ∪)
Adds Figure 1 contrasting the mainland concave inverted-U (β₂=-1.012***, peak ~43%)
with the Pacific SIDS capability-conditioned convex U-shape (β₂=+0.844, p_wild=.07;
penalty zone where most firms operate). VN version embedded in thesis §4.7.2
(Hình 4.7.1); EN version in the redesigned manuscript (§4.2). Generator script +
both PNGs committed.
</commit_message>
<xml_diff>
--- a/p8/p8_pacific_sids_redesigned_en.docx
+++ b/p8/p8_pacific_sids_redesigned_en.docx
@@ -1376,7 +1376,31 @@
         <w:t xml:space="preserve"> </w:t>
       </w:r>
       <w:r>
-        <w:t xml:space="preserve">around the high-FSTS region that few island firms reach. This is the mirror image of the mainland inverted-U. Substantively, the dominant mass of SIDS firms—almost all at low-to-moderate FSTS—sits on the</w:t>
+        <w:t xml:space="preserve">around the high-FSTS region that few island firms reach. This is the mirror image of the mainland inverted-U.</w:t>
+      </w:r>
+    </w:p>
+    <w:p>
+      <w:pPr>
+        <w:pStyle w:val="BodyText"/>
+      </w:pPr>
+      <w:r>
+        <w:rPr>
+          <w:bCs/>
+          <w:b/>
+        </w:rPr>
+        <w:t xml:space="preserve">Figure 1.</w:t>
+      </w:r>
+      <w:r>
+        <w:t xml:space="preserve"> </w:t>
+      </w:r>
+      <w:r>
+        <w:t xml:space="preserve">The inverted-U inverts at the periphery. Mainland transition economies show a concave inverted-U (panel a); Pacific SIDS, conditional on firm capability, show a convex U-shape (panel b) with a productivity penalty across the low-to-moderate export-intensity range where almost all island firms operate.</w:t>
+      </w:r>
+      <w:r>
+        <w:t xml:space="preserve"> </w:t>
+      </w:r>
+      <w:r>
+        <w:t xml:space="preserve">Substantively, the dominant mass of SIDS firms—almost all at low-to-moderate FSTS—sits on the</w:t>
       </w:r>
       <w:r>
         <w:t xml:space="preserve"> </w:t>

</xml_diff>

<commit_message>
build(p8-fig): embed Figure 1 in manuscript docx + thesis PDF (Hình 4.7.1)
Co-Authored-By: Claude Opus 4.8 (1M context) <noreply@anthropic.com>
Claude-Session: https://claude.ai/code/session_01Xumaoraa2DLWLXsgJJ62oq
</commit_message>
<xml_diff>
--- a/p8/p8_pacific_sids_redesigned_en.docx
+++ b/p8/p8_pacific_sids_redesigned_en.docx
@@ -2,7 +2,7 @@
 <file path=word/document.xml><?xml version="1.0" encoding="utf-8"?>
 <w:document xmlns:w="http://schemas.openxmlformats.org/wordprocessingml/2006/main" xmlns:m="http://schemas.openxmlformats.org/officeDocument/2006/math" xmlns:r="http://schemas.openxmlformats.org/officeDocument/2006/relationships" xmlns:o="urn:schemas-microsoft-com:office:office" xmlns:v="urn:schemas-microsoft-com:vml" xmlns:w10="urn:schemas-microsoft-com:office:word" xmlns:a="http://schemas.openxmlformats.org/drawingml/2006/main" xmlns:pic="http://schemas.openxmlformats.org/drawingml/2006/picture" xmlns:wp="http://schemas.openxmlformats.org/drawingml/2006/wordprocessingDrawing">
   <w:body>
-    <w:bookmarkStart w:id="42" w:name="Xe1f642b2198df26d89e85064018a7f36fdfdafe"/>
+    <w:bookmarkStart w:id="45" w:name="Xe1f642b2198df26d89e85064018a7f36fdfdafe"/>
     <w:p>
       <w:pPr>
         <w:pStyle w:val="Heading1"/>
@@ -740,7 +740,7 @@
     </w:p>
     <w:bookmarkEnd w:id="28"/>
     <w:bookmarkEnd w:id="29"/>
-    <w:bookmarkStart w:id="34" w:name="results"/>
+    <w:bookmarkStart w:id="37" w:name="results"/>
     <w:p>
       <w:pPr>
         <w:pStyle w:val="Heading2"/>
@@ -1317,7 +1317,7 @@
       </w:r>
     </w:p>
     <w:bookmarkEnd w:id="30"/>
-    <w:bookmarkStart w:id="31" w:name="Xf6fcaf231835c609f5bea03c61b13cc30188faa"/>
+    <w:bookmarkStart w:id="34" w:name="Xf6fcaf231835c609f5bea03c61b13cc30188faa"/>
     <w:p>
       <w:pPr>
         <w:pStyle w:val="Heading3"/>
@@ -1384,23 +1384,161 @@
         <w:pStyle w:val="BodyText"/>
       </w:pPr>
       <w:r>
+        <w:drawing>
+          <wp:inline>
+            <wp:extent cx="5334000" cy="2402940"/>
+            <wp:effectExtent b="0" l="0" r="0" t="0"/>
+            <wp:docPr descr="Figure 1. The inverted-U inverts at the periphery. Mainland transition economies show a concave inverted-U (panel a); Pacific SIDS, conditional on firm capability, show a convex U-shape (panel b) with a productivity penalty across the low-to-moderate export-intensity range where almost all island firms operate." title="" id="32" name="Picture"/>
+            <a:graphic>
+              <a:graphicData uri="http://schemas.openxmlformats.org/drawingml/2006/picture">
+                <pic:pic>
+                  <pic:nvPicPr>
+                    <pic:cNvPr descr="figures/p8_fig1_dissolution_en.png" id="33" name="Picture"/>
+                    <pic:cNvPicPr>
+                      <a:picLocks noChangeArrowheads="1" noChangeAspect="1"/>
+                    </pic:cNvPicPr>
+                  </pic:nvPicPr>
+                  <pic:blipFill>
+                    <a:blip r:embed="rId31"/>
+                    <a:stretch>
+                      <a:fillRect/>
+                    </a:stretch>
+                  </pic:blipFill>
+                  <pic:spPr bwMode="auto">
+                    <a:xfrm>
+                      <a:off x="0" y="0"/>
+                      <a:ext cx="5334000" cy="2402940"/>
+                    </a:xfrm>
+                    <a:prstGeom prst="rect">
+                      <a:avLst/>
+                    </a:prstGeom>
+                    <a:noFill/>
+                    <a:ln w="9525">
+                      <a:noFill/>
+                      <a:headEnd/>
+                      <a:tailEnd/>
+                    </a:ln>
+                  </pic:spPr>
+                </pic:pic>
+              </a:graphicData>
+            </a:graphic>
+          </wp:inline>
+        </w:drawing>
+      </w:r>
+      <w:r>
+        <w:t xml:space="preserve"> </w:t>
+      </w:r>
+      <w:r>
+        <w:t xml:space="preserve">Substantively, the dominant mass of SIDS firms—almost all at low-to-moderate FSTS—sits on the</w:t>
+      </w:r>
+      <w:r>
+        <w:t xml:space="preserve"> </w:t>
+      </w:r>
+      <w:r>
         <w:rPr>
           <w:bCs/>
           <w:b/>
         </w:rPr>
-        <w:t xml:space="preserve">Figure 1.</w:t>
-      </w:r>
-      <w:r>
-        <w:t xml:space="preserve"> </w:t>
-      </w:r>
-      <w:r>
-        <w:t xml:space="preserve">The inverted-U inverts at the periphery. Mainland transition economies show a concave inverted-U (panel a); Pacific SIDS, conditional on firm capability, show a convex U-shape (panel b) with a productivity penalty across the low-to-moderate export-intensity range where almost all island firms operate.</w:t>
-      </w:r>
-      <w:r>
-        <w:t xml:space="preserve"> </w:t>
-      </w:r>
-      <w:r>
-        <w:t xml:space="preserve">Substantively, the dominant mass of SIDS firms—almost all at low-to-moderate FSTS—sits on the</w:t>
+        <w:t xml:space="preserve">descending limb</w:t>
+      </w:r>
+      <w:r>
+        <w:t xml:space="preserve">, where additional export intensity is associated with lower productivity: the empirical signature consistent with the FIP mechanism.</w:t>
+      </w:r>
+    </w:p>
+    <w:bookmarkEnd w:id="34"/>
+    <w:bookmarkStart w:id="35" w:name="X1ea8c2ad15cb7c09920f63ce7a15cab454d20ea"/>
+    <w:p>
+      <w:pPr>
+        <w:pStyle w:val="Heading3"/>
+      </w:pPr>
+      <w:r>
+        <w:t xml:space="preserve">4.3 Capability raises the level but does not restore the curve (Proposition 3)</w:t>
+      </w:r>
+    </w:p>
+    <w:p>
+      <w:pPr>
+        <w:pStyle w:val="FirstParagraph"/>
+      </w:pPr>
+      <w:r>
+        <w:t xml:space="preserve">Technological capability carries a positive, robust level effect (TCI: β = +0.141, wild-bootstrap p = .04); digital adoption is positive but weaker (DAI: β = +0.105). Neither restores a concave inverted-U—indeed, conditioning on capability sharpens the</w:t>
+      </w:r>
+      <w:r>
+        <w:t xml:space="preserve"> </w:t>
+      </w:r>
+      <w:r>
+        <w:rPr>
+          <w:iCs/>
+          <w:i/>
+        </w:rPr>
+        <w:t xml:space="preserve">convex</w:t>
+      </w:r>
+      <w:r>
+        <w:t xml:space="preserve"> </w:t>
+      </w:r>
+      <w:r>
+        <w:t xml:space="preserve">pattern. Capability thus operates as a productivity level-shifter that cannot substitute for the absent structural prerequisites, consistent with Proposition 3.</w:t>
+      </w:r>
+    </w:p>
+    <w:bookmarkEnd w:id="35"/>
+    <w:bookmarkStart w:id="36" w:name="X6b69706d2d7f3126900ddee0832af27a33d49f9"/>
+    <w:p>
+      <w:pPr>
+        <w:pStyle w:val="Heading3"/>
+      </w:pPr>
+      <w:r>
+        <w:t xml:space="preserve">4.4 Transparency: sensitivity of any strong negative estimate</w:t>
+      </w:r>
+    </w:p>
+    <w:p>
+      <w:pPr>
+        <w:pStyle w:val="FirstParagraph"/>
+      </w:pPr>
+      <w:r>
+        <w:t xml:space="preserve">We report openly that the</w:t>
+      </w:r>
+      <w:r>
+        <w:t xml:space="preserve"> </w:t>
+      </w:r>
+      <w:r>
+        <w:rPr>
+          <w:iCs/>
+          <w:i/>
+        </w:rPr>
+        <w:t xml:space="preserve">magnitude</w:t>
+      </w:r>
+      <w:r>
+        <w:t xml:space="preserve"> </w:t>
+      </w:r>
+      <w:r>
+        <w:t xml:space="preserve">of any strong negative I–P estimate in this setting is sensitive to which island economies enter the sample. A more restrictive build limited to the few economies with complete pre-2018 control data yields a large, significant negative slope, whereas the full eight-economy sample yields the null-to-convex pattern reported above; with only three to nine clusters, cluster inference is unreliable in the restrictive build. We therefore anchor our claims on the full sample with wild-bootstrap inference and present FIP as a theoretical limiting case rather than a precisely estimated effect. This transparency is itself a methodological contribution to firm-level research on data-scarce micro-economies.</w:t>
+      </w:r>
+    </w:p>
+    <w:bookmarkEnd w:id="36"/>
+    <w:bookmarkEnd w:id="37"/>
+    <w:bookmarkStart w:id="42" w:name="discussion"/>
+    <w:p>
+      <w:pPr>
+        <w:pStyle w:val="Heading2"/>
+      </w:pPr>
+      <w:r>
+        <w:t xml:space="preserve">5. Discussion</w:t>
+      </w:r>
+    </w:p>
+    <w:bookmarkStart w:id="38" w:name="bounding-the-inverted-u-paradigm"/>
+    <w:p>
+      <w:pPr>
+        <w:pStyle w:val="Heading3"/>
+      </w:pPr>
+      <w:r>
+        <w:t xml:space="preserve">5.1 Bounding the inverted-U paradigm</w:t>
+      </w:r>
+    </w:p>
+    <w:p>
+      <w:pPr>
+        <w:pStyle w:val="FirstParagraph"/>
+      </w:pPr>
+      <w:r>
+        <w:t xml:space="preserve">Our central result is that the inverted-U I–P relationship does not extend to the Pacific periphery. The shape that organizes the I–P literature dissolves, and—conditional on capability—inverts. This is not a failure of measurement but a</w:t>
       </w:r>
       <w:r>
         <w:t xml:space="preserve"> </w:t>
@@ -1410,20 +1548,36 @@
           <w:bCs/>
           <w:b/>
         </w:rPr>
-        <w:t xml:space="preserve">descending limb</w:t>
-      </w:r>
-      <w:r>
-        <w:t xml:space="preserve">, where additional export intensity is associated with lower productivity: the empirical signature consistent with the FIP mechanism.</w:t>
-      </w:r>
-    </w:p>
-    <w:bookmarkEnd w:id="31"/>
-    <w:bookmarkStart w:id="32" w:name="X1ea8c2ad15cb7c09920f63ce7a15cab454d20ea"/>
+        <w:t xml:space="preserve">boundary condition</w:t>
+      </w:r>
+      <w:r>
+        <w:t xml:space="preserve">: the inverted-U presupposes a viable domestic market, manageable trade costs, and institutional support, and where these are jointly absent the relationship the paradigm predicts simply does not obtain. The finding reframes a long line of work (Hitt et al., 1997; Lu &amp; Beamish, 2004) as</w:t>
+      </w:r>
+      <w:r>
+        <w:t xml:space="preserve"> </w:t>
+      </w:r>
+      <w:r>
+        <w:rPr>
+          <w:iCs/>
+          <w:i/>
+        </w:rPr>
+        <w:t xml:space="preserve">conditionally</w:t>
+      </w:r>
+      <w:r>
+        <w:t xml:space="preserve"> </w:t>
+      </w:r>
+      <w:r>
+        <w:t xml:space="preserve">rather than universally applicable, and it offers a structural explanation for the weak and unstable estimates that large-sample replications have reported (Berry &amp; Kaul, 2016; Pisani et al., 2020): pooling prerequisite-rich and prerequisite-poor contexts averages incompatible functional forms.</w:t>
+      </w:r>
+    </w:p>
+    <w:bookmarkEnd w:id="38"/>
+    <w:bookmarkStart w:id="39" w:name="X792abec52ac6eb1fe9bce5eb715fccffde07de4"/>
     <w:p>
       <w:pPr>
         <w:pStyle w:val="Heading3"/>
       </w:pPr>
       <w:r>
-        <w:t xml:space="preserve">4.3 Capability raises the level but does not restore the curve (Proposition 3)</w:t>
+        <w:t xml:space="preserve">5.2 The contribution of FIP as a delimited concept</w:t>
       </w:r>
     </w:p>
     <w:p>
@@ -1431,33 +1585,17 @@
         <w:pStyle w:val="FirstParagraph"/>
       </w:pPr>
       <w:r>
-        <w:t xml:space="preserve">Technological capability carries a positive, robust level effect (TCI: β = +0.141, wild-bootstrap p = .04); digital adoption is positive but weaker (DAI: β = +0.105). Neither restores a concave inverted-U—indeed, conditioning on capability sharpens the</w:t>
-      </w:r>
-      <w:r>
-        <w:t xml:space="preserve"> </w:t>
-      </w:r>
-      <w:r>
-        <w:rPr>
-          <w:iCs/>
-          <w:i/>
-        </w:rPr>
-        <w:t xml:space="preserve">convex</w:t>
-      </w:r>
-      <w:r>
-        <w:t xml:space="preserve"> </w:t>
-      </w:r>
-      <w:r>
-        <w:t xml:space="preserve">pattern. Capability thus operates as a productivity level-shifter that cannot substitute for the absent structural prerequisites, consistent with Proposition 3.</w:t>
-      </w:r>
-    </w:p>
-    <w:bookmarkEnd w:id="32"/>
-    <w:bookmarkStart w:id="33" w:name="X6b69706d2d7f3126900ddee0832af27a33d49f9"/>
+        <w:t xml:space="preserve">By naming and delimiting the Forced Internationalization Penalty, we give the field a label for the limiting case at the extreme periphery and a set of distinguishing criteria separating it from phase-one S-curve costs, the liability of foreignness, and necessity entrepreneurship. The construct’s value lies in marking where universal internationalization theories stop, independent of the precise coefficient one estimates—an instance of theory development through the specification of scope conditions.</w:t>
+      </w:r>
+    </w:p>
+    <w:bookmarkEnd w:id="39"/>
+    <w:bookmarkStart w:id="40" w:name="policy-implications"/>
     <w:p>
       <w:pPr>
         <w:pStyle w:val="Heading3"/>
       </w:pPr>
       <w:r>
-        <w:t xml:space="preserve">4.4 Transparency: sensitivity of any strong negative estimate</w:t>
+        <w:t xml:space="preserve">5.3 Policy implications</w:t>
       </w:r>
     </w:p>
     <w:p>
@@ -1465,43 +1603,17 @@
         <w:pStyle w:val="FirstParagraph"/>
       </w:pPr>
       <w:r>
-        <w:t xml:space="preserve">We report openly that the</w:t>
-      </w:r>
-      <w:r>
-        <w:t xml:space="preserve"> </w:t>
-      </w:r>
-      <w:r>
-        <w:rPr>
-          <w:iCs/>
-          <w:i/>
-        </w:rPr>
-        <w:t xml:space="preserve">magnitude</w:t>
-      </w:r>
-      <w:r>
-        <w:t xml:space="preserve"> </w:t>
-      </w:r>
-      <w:r>
-        <w:t xml:space="preserve">of any strong negative I–P estimate in this setting is sensitive to which island economies enter the sample. A more restrictive build limited to the few economies with complete pre-2018 control data yields a large, significant negative slope, whereas the full eight-economy sample yields the null-to-convex pattern reported above; with only three to nine clusters, cluster inference is unreliable in the restrictive build. We therefore anchor our claims on the full sample with wild-bootstrap inference and present FIP as a theoretical limiting case rather than a precisely estimated effect. This transparency is itself a methodological contribution to firm-level research on data-scarce micro-economies.</w:t>
-      </w:r>
-    </w:p>
-    <w:bookmarkEnd w:id="33"/>
-    <w:bookmarkEnd w:id="34"/>
-    <w:bookmarkStart w:id="39" w:name="discussion"/>
-    <w:p>
-      <w:pPr>
-        <w:pStyle w:val="Heading2"/>
-      </w:pPr>
-      <w:r>
-        <w:t xml:space="preserve">5. Discussion</w:t>
-      </w:r>
-    </w:p>
-    <w:bookmarkStart w:id="35" w:name="bounding-the-inverted-u-paradigm"/>
+        <w:t xml:space="preserve">For development policy, the result cautions against export-intensification as a stand-alone growth lever in microstates. If the binding constraints are domestic-market viability, trade costs, and institutions, then promoting export intensity without addressing those prerequisites pushes firms further onto the descending limb. Complementary structural interventions—regional market integration to relax the domestic-scale constraint, trade-cost reduction, and targeted institutional development—are prior conditions for export-led growth to deliver productivity gains. This aligns with evidence that development progress in SIDS has been the slowest on record (Mahler, Serajuddin, Wadhwa, &amp; Yonzan, 2026).</w:t>
+      </w:r>
+    </w:p>
+    <w:bookmarkEnd w:id="40"/>
+    <w:bookmarkStart w:id="41" w:name="limitations-and-future-research"/>
     <w:p>
       <w:pPr>
         <w:pStyle w:val="Heading3"/>
       </w:pPr>
       <w:r>
-        <w:t xml:space="preserve">5.1 Bounding the inverted-U paradigm</w:t>
+        <w:t xml:space="preserve">5.4 Limitations and future research</w:t>
       </w:r>
     </w:p>
     <w:p>
@@ -1509,714 +1621,631 @@
         <w:pStyle w:val="FirstParagraph"/>
       </w:pPr>
       <w:r>
-        <w:t xml:space="preserve">Our central result is that the inverted-U I–P relationship does not extend to the Pacific periphery. The shape that organizes the I–P literature dissolves, and—conditional on capability—inverts. This is not a failure of measurement but a</w:t>
-      </w:r>
-      <w:r>
-        <w:t xml:space="preserve"> </w:t>
-      </w:r>
-      <w:r>
-        <w:rPr>
-          <w:bCs/>
-          <w:b/>
-        </w:rPr>
-        <w:t xml:space="preserve">boundary condition</w:t>
-      </w:r>
-      <w:r>
-        <w:t xml:space="preserve">: the inverted-U presupposes a viable domestic market, manageable trade costs, and institutional support, and where these are jointly absent the relationship the paradigm predicts simply does not obtain. The finding reframes a long line of work (Hitt et al., 1997; Lu &amp; Beamish, 2004) as</w:t>
-      </w:r>
-      <w:r>
-        <w:t xml:space="preserve"> </w:t>
-      </w:r>
-      <w:r>
-        <w:rPr>
-          <w:iCs/>
-          <w:i/>
-        </w:rPr>
-        <w:t xml:space="preserve">conditionally</w:t>
-      </w:r>
-      <w:r>
-        <w:t xml:space="preserve"> </w:t>
-      </w:r>
-      <w:r>
-        <w:t xml:space="preserve">rather than universally applicable, and it offers a structural explanation for the weak and unstable estimates that large-sample replications have reported (Berry &amp; Kaul, 2016; Pisani et al., 2020): pooling prerequisite-rich and prerequisite-poor contexts averages incompatible functional forms.</w:t>
-      </w:r>
-    </w:p>
-    <w:bookmarkEnd w:id="35"/>
-    <w:bookmarkStart w:id="36" w:name="X792abec52ac6eb1fe9bce5eb715fccffde07de4"/>
-    <w:p>
-      <w:pPr>
-        <w:pStyle w:val="Heading3"/>
-      </w:pPr>
-      <w:r>
-        <w:t xml:space="preserve">5.2 The contribution of FIP as a delimited concept</w:t>
-      </w:r>
-    </w:p>
-    <w:p>
-      <w:pPr>
-        <w:pStyle w:val="FirstParagraph"/>
-      </w:pPr>
-      <w:r>
-        <w:t xml:space="preserve">By naming and delimiting the Forced Internationalization Penalty, we give the field a label for the limiting case at the extreme periphery and a set of distinguishing criteria separating it from phase-one S-curve costs, the liability of foreignness, and necessity entrepreneurship. The construct’s value lies in marking where universal internationalization theories stop, independent of the precise coefficient one estimates—an instance of theory development through the specification of scope conditions.</w:t>
-      </w:r>
-    </w:p>
-    <w:bookmarkEnd w:id="36"/>
-    <w:bookmarkStart w:id="37" w:name="policy-implications"/>
-    <w:p>
-      <w:pPr>
-        <w:pStyle w:val="Heading3"/>
-      </w:pPr>
-      <w:r>
-        <w:t xml:space="preserve">5.3 Policy implications</w:t>
-      </w:r>
-    </w:p>
-    <w:p>
-      <w:pPr>
-        <w:pStyle w:val="FirstParagraph"/>
-      </w:pPr>
-      <w:r>
-        <w:t xml:space="preserve">For development policy, the result cautions against export-intensification as a stand-alone growth lever in microstates. If the binding constraints are domestic-market viability, trade costs, and institutions, then promoting export intensity without addressing those prerequisites pushes firms further onto the descending limb. Complementary structural interventions—regional market integration to relax the domestic-scale constraint, trade-cost reduction, and targeted institutional development—are prior conditions for export-led growth to deliver productivity gains. This aligns with evidence that development progress in SIDS has been the slowest on record (Mahler, Serajuddin, Wadhwa, &amp; Yonzan, 2026).</w:t>
-      </w:r>
-    </w:p>
-    <w:bookmarkEnd w:id="37"/>
-    <w:bookmarkStart w:id="38" w:name="limitations-and-future-research"/>
-    <w:p>
-      <w:pPr>
-        <w:pStyle w:val="Heading3"/>
-      </w:pPr>
-      <w:r>
-        <w:t xml:space="preserve">5.4 Limitations and future research</w:t>
-      </w:r>
-    </w:p>
-    <w:p>
-      <w:pPr>
-        <w:pStyle w:val="FirstParagraph"/>
-      </w:pPr>
-      <w:r>
         <w:t xml:space="preserve">Three limitations bound the findings. First, the design is cross-sectional repeated cross-sections with few clusters; we mitigate few-cluster over-rejection with wild bootstrap, but causal identification awaits panel data across more island economies. Second, the digital-adoption measure is Tier-1 (website) only, the comparably available indicator across SIDS waves; richer digital capability cannot be assessed. Third, generalization beyond the Pacific is untested—Caribbean and Indian-Ocean SIDS are natural extension contexts that would also raise the cluster count needed for sharper inference. A definitive test of FIP as an estimated effect, as opposed to a bounding concept, requires more complete firm-level data across a larger set of microstates.</w:t>
-      </w:r>
-    </w:p>
-    <w:bookmarkEnd w:id="38"/>
-    <w:bookmarkEnd w:id="39"/>
-    <w:bookmarkStart w:id="40" w:name="conclusion"/>
-    <w:p>
-      <w:pPr>
-        <w:pStyle w:val="Heading2"/>
-      </w:pPr>
-      <w:r>
-        <w:t xml:space="preserve">6. Conclusion</w:t>
-      </w:r>
-    </w:p>
-    <w:p>
-      <w:pPr>
-        <w:pStyle w:val="FirstParagraph"/>
-      </w:pPr>
-      <w:r>
-        <w:t xml:space="preserve">The inverted-U is the workhorse functional form of the internationalization–performance literature, but its generating logic presupposes structural prerequisites that the world’s most peripheral economies lack. Using firm-level data from eight Pacific island states and Timor-Leste, we show that the inverted-U dissolves at this periphery and, conditional on capability, inverts into a convex penalty across the export-intensity range where island firms actually operate. We name the limiting case the Forced Internationalization Penalty and position it as a scope condition of universal internationalization theory. The paradigm is conditional, not universal: where the domestic market is too small, trade costs too high, and institutions too thin, intensifying internationalization is not a path to performance but a structural burden.</w:t>
-      </w:r>
-    </w:p>
-    <w:bookmarkEnd w:id="40"/>
-    <w:bookmarkStart w:id="41" w:name="references"/>
-    <w:p>
-      <w:pPr>
-        <w:pStyle w:val="Heading2"/>
-      </w:pPr>
-      <w:r>
-        <w:t xml:space="preserve">References</w:t>
-      </w:r>
-    </w:p>
-    <w:p>
-      <w:pPr>
-        <w:pStyle w:val="FirstParagraph"/>
-      </w:pPr>
-      <w:r>
-        <w:t xml:space="preserve">Bausch, A., &amp; Krist, M. (2007). The effect of context-related moderators on the internationalization–performance relationship: Evidence from meta-analysis.</w:t>
-      </w:r>
-      <w:r>
-        <w:t xml:space="preserve"> </w:t>
-      </w:r>
-      <w:r>
-        <w:rPr>
-          <w:iCs/>
-          <w:i/>
-        </w:rPr>
-        <w:t xml:space="preserve">Management International Review, 47</w:t>
-      </w:r>
-      <w:r>
-        <w:t xml:space="preserve">(3), 319–347. https://doi.org/10.1007/s11575-007-0019-z</w:t>
-      </w:r>
-    </w:p>
-    <w:p>
-      <w:pPr>
-        <w:pStyle w:val="BodyText"/>
-      </w:pPr>
-      <w:r>
-        <w:t xml:space="preserve">Berry, H., &amp; Kaul, A. (2016). Replicating the multinationality–performance relationship: Is there an S-curve?</w:t>
-      </w:r>
-      <w:r>
-        <w:t xml:space="preserve"> </w:t>
-      </w:r>
-      <w:r>
-        <w:rPr>
-          <w:iCs/>
-          <w:i/>
-        </w:rPr>
-        <w:t xml:space="preserve">Strategic Management Journal, 37</w:t>
-      </w:r>
-      <w:r>
-        <w:t xml:space="preserve">(11), 2275–2290. https://doi.org/10.1002/smj.2567</w:t>
-      </w:r>
-    </w:p>
-    <w:p>
-      <w:pPr>
-        <w:pStyle w:val="BodyText"/>
-      </w:pPr>
-      <w:r>
-        <w:t xml:space="preserve">Briguglio, L. (1995). Small island developing states and their economic vulnerabilities.</w:t>
-      </w:r>
-      <w:r>
-        <w:t xml:space="preserve"> </w:t>
-      </w:r>
-      <w:r>
-        <w:rPr>
-          <w:iCs/>
-          <w:i/>
-        </w:rPr>
-        <w:t xml:space="preserve">World Development, 23</w:t>
-      </w:r>
-      <w:r>
-        <w:t xml:space="preserve">(9), 1615–1632. https://doi.org/10.1016/0305-750X(95)00065-K</w:t>
-      </w:r>
-    </w:p>
-    <w:p>
-      <w:pPr>
-        <w:pStyle w:val="BodyText"/>
-      </w:pPr>
-      <w:r>
-        <w:t xml:space="preserve">Cameron, A. C., Gelbach, J. B., &amp; Miller, D. L. (2008). Bootstrap-based improvements for inference with clustered errors.</w:t>
-      </w:r>
-      <w:r>
-        <w:t xml:space="preserve"> </w:t>
-      </w:r>
-      <w:r>
-        <w:rPr>
-          <w:iCs/>
-          <w:i/>
-        </w:rPr>
-        <w:t xml:space="preserve">The Review of Economics and Statistics, 90</w:t>
-      </w:r>
-      <w:r>
-        <w:t xml:space="preserve">(3), 414–427. https://doi.org/10.1162/rest.90.3.414</w:t>
-      </w:r>
-    </w:p>
-    <w:p>
-      <w:pPr>
-        <w:pStyle w:val="BodyText"/>
-      </w:pPr>
-      <w:r>
-        <w:t xml:space="preserve">Cohen, W. M., &amp; Levinthal, D. A. (1990). Absorptive capacity: A new perspective on learning and innovation.</w:t>
-      </w:r>
-      <w:r>
-        <w:t xml:space="preserve"> </w:t>
-      </w:r>
-      <w:r>
-        <w:rPr>
-          <w:iCs/>
-          <w:i/>
-        </w:rPr>
-        <w:t xml:space="preserve">Administrative Science Quarterly, 35</w:t>
-      </w:r>
-      <w:r>
-        <w:t xml:space="preserve">(1), 128–152. https://doi.org/10.2307/2393553</w:t>
-      </w:r>
-    </w:p>
-    <w:p>
-      <w:pPr>
-        <w:pStyle w:val="BodyText"/>
-      </w:pPr>
-      <w:r>
-        <w:t xml:space="preserve">Contractor, F. J., Kundu, S. K., &amp; Hsu, C.-C. (2003). A three-stage theory of international expansion: The link between multinationality and performance in the service sector.</w:t>
-      </w:r>
-      <w:r>
-        <w:t xml:space="preserve"> </w:t>
-      </w:r>
-      <w:r>
-        <w:rPr>
-          <w:iCs/>
-          <w:i/>
-        </w:rPr>
-        <w:t xml:space="preserve">Journal of International Business Studies, 34</w:t>
-      </w:r>
-      <w:r>
-        <w:t xml:space="preserve">(1), 5–18. https://doi.org/10.1057/palgrave.jibs.8400003</w:t>
-      </w:r>
-    </w:p>
-    <w:p>
-      <w:pPr>
-        <w:pStyle w:val="BodyText"/>
-      </w:pPr>
-      <w:r>
-        <w:t xml:space="preserve">Diamantopoulos, A., &amp; Winklhofer, H. M. (2001). Index construction with formative indicators: An alternative to scale development.</w:t>
-      </w:r>
-      <w:r>
-        <w:t xml:space="preserve"> </w:t>
-      </w:r>
-      <w:r>
-        <w:rPr>
-          <w:iCs/>
-          <w:i/>
-        </w:rPr>
-        <w:t xml:space="preserve">Journal of Marketing Research, 38</w:t>
-      </w:r>
-      <w:r>
-        <w:t xml:space="preserve">(2), 269–277. https://doi.org/10.1509/jmkr.38.2.269.18845</w:t>
-      </w:r>
-    </w:p>
-    <w:p>
-      <w:pPr>
-        <w:pStyle w:val="BodyText"/>
-      </w:pPr>
-      <w:r>
-        <w:t xml:space="preserve">Doh, J. P., Rodrigues, S., Saka-Helmhout, A., &amp; Makhija, M. (2017). International business responses to institutional voids.</w:t>
-      </w:r>
-      <w:r>
-        <w:t xml:space="preserve"> </w:t>
-      </w:r>
-      <w:r>
-        <w:rPr>
-          <w:iCs/>
-          <w:i/>
-        </w:rPr>
-        <w:t xml:space="preserve">Journal of International Business Studies, 48</w:t>
-      </w:r>
-      <w:r>
-        <w:t xml:space="preserve">(3), 293–307. https://doi.org/10.1057/s41267-017-0074-z</w:t>
-      </w:r>
-    </w:p>
-    <w:p>
-      <w:pPr>
-        <w:pStyle w:val="BodyText"/>
-      </w:pPr>
-      <w:r>
-        <w:t xml:space="preserve">Haans, R. F. J., Pieters, C., &amp; He, Z.-L. (2016). Thinking about U: Theorizing and testing U- and inverted U-shaped relationships in strategy research.</w:t>
-      </w:r>
-      <w:r>
-        <w:t xml:space="preserve"> </w:t>
-      </w:r>
-      <w:r>
-        <w:rPr>
-          <w:iCs/>
-          <w:i/>
-        </w:rPr>
-        <w:t xml:space="preserve">Strategic Management Journal, 37</w:t>
-      </w:r>
-      <w:r>
-        <w:t xml:space="preserve">(7), 1177–1195. https://doi.org/10.1002/smj.2399</w:t>
-      </w:r>
-    </w:p>
-    <w:p>
-      <w:pPr>
-        <w:pStyle w:val="BodyText"/>
-      </w:pPr>
-      <w:r>
-        <w:t xml:space="preserve">Hennart, J.-F. (2007). The theoretical rationale for a multinationality–performance relationship.</w:t>
-      </w:r>
-      <w:r>
-        <w:t xml:space="preserve"> </w:t>
-      </w:r>
-      <w:r>
-        <w:rPr>
-          <w:iCs/>
-          <w:i/>
-        </w:rPr>
-        <w:t xml:space="preserve">Management International Review, 47</w:t>
-      </w:r>
-      <w:r>
-        <w:t xml:space="preserve">(3), 423–452. https://doi.org/10.1007/s11575-007-0023-3</w:t>
-      </w:r>
-    </w:p>
-    <w:p>
-      <w:pPr>
-        <w:pStyle w:val="BodyText"/>
-      </w:pPr>
-      <w:r>
-        <w:t xml:space="preserve">Hitt, M. A., Hoskisson, R. E., &amp; Kim, H. (1997). International diversification: Effects on innovation and firm performance in product-diversified firms.</w:t>
-      </w:r>
-      <w:r>
-        <w:t xml:space="preserve"> </w:t>
-      </w:r>
-      <w:r>
-        <w:rPr>
-          <w:iCs/>
-          <w:i/>
-        </w:rPr>
-        <w:t xml:space="preserve">Academy of Management Journal, 40</w:t>
-      </w:r>
-      <w:r>
-        <w:t xml:space="preserve">(4), 767–798. https://doi.org/10.2307/256948</w:t>
-      </w:r>
-    </w:p>
-    <w:p>
-      <w:pPr>
-        <w:pStyle w:val="BodyText"/>
-      </w:pPr>
-      <w:r>
-        <w:t xml:space="preserve">Hsieh, C.-T., &amp; Klenow, P. J. (2009). Misallocation and manufacturing TFP in China and India.</w:t>
-      </w:r>
-      <w:r>
-        <w:t xml:space="preserve"> </w:t>
-      </w:r>
-      <w:r>
-        <w:rPr>
-          <w:iCs/>
-          <w:i/>
-        </w:rPr>
-        <w:t xml:space="preserve">The Quarterly Journal of Economics, 124</w:t>
-      </w:r>
-      <w:r>
-        <w:t xml:space="preserve">(4), 1403–1448. https://doi.org/10.1162/qjec.2009.124.4.1403</w:t>
-      </w:r>
-    </w:p>
-    <w:p>
-      <w:pPr>
-        <w:pStyle w:val="BodyText"/>
-      </w:pPr>
-      <w:r>
-        <w:t xml:space="preserve">Jarvis, C. B., MacKenzie, S. B., &amp; Podsakoff, P. M. (2003). A critical review of construct indicators and measurement model misspecification in marketing and consumer research.</w:t>
-      </w:r>
-      <w:r>
-        <w:t xml:space="preserve"> </w:t>
-      </w:r>
-      <w:r>
-        <w:rPr>
-          <w:iCs/>
-          <w:i/>
-        </w:rPr>
-        <w:t xml:space="preserve">Journal of Consumer Research, 30</w:t>
-      </w:r>
-      <w:r>
-        <w:t xml:space="preserve">(2), 199–218. https://doi.org/10.1086/376806</w:t>
-      </w:r>
-    </w:p>
-    <w:p>
-      <w:pPr>
-        <w:pStyle w:val="BodyText"/>
-      </w:pPr>
-      <w:r>
-        <w:t xml:space="preserve">Johanson, J., &amp; Vahlne, J.-E. (1977). The internationalization process of the firm: A model of knowledge development and increasing foreign market commitments.</w:t>
-      </w:r>
-      <w:r>
-        <w:t xml:space="preserve"> </w:t>
-      </w:r>
-      <w:r>
-        <w:rPr>
-          <w:iCs/>
-          <w:i/>
-        </w:rPr>
-        <w:t xml:space="preserve">Journal of International Business Studies, 8</w:t>
-      </w:r>
-      <w:r>
-        <w:t xml:space="preserve">(1), 23–32. https://doi.org/10.1057/palgrave.jibs.8490676</w:t>
-      </w:r>
-    </w:p>
-    <w:p>
-      <w:pPr>
-        <w:pStyle w:val="BodyText"/>
-      </w:pPr>
-      <w:r>
-        <w:t xml:space="preserve">Johanson, J., &amp; Vahlne, J.-E. (2009). The Uppsala internationalization process model revisited: From liability of foreignness to liability of outsidership.</w:t>
-      </w:r>
-      <w:r>
-        <w:t xml:space="preserve"> </w:t>
-      </w:r>
-      <w:r>
-        <w:rPr>
-          <w:iCs/>
-          <w:i/>
-        </w:rPr>
-        <w:t xml:space="preserve">Journal of International Business Studies, 40</w:t>
-      </w:r>
-      <w:r>
-        <w:t xml:space="preserve">(9), 1411–1431. https://doi.org/10.1057/jibs.2009.24</w:t>
-      </w:r>
-    </w:p>
-    <w:p>
-      <w:pPr>
-        <w:pStyle w:val="BodyText"/>
-      </w:pPr>
-      <w:r>
-        <w:t xml:space="preserve">Khanna, T., &amp; Palepu, K. G. (2010).</w:t>
-      </w:r>
-      <w:r>
-        <w:t xml:space="preserve"> </w:t>
-      </w:r>
-      <w:r>
-        <w:rPr>
-          <w:iCs/>
-          <w:i/>
-        </w:rPr>
-        <w:t xml:space="preserve">Winning in emerging markets: A road map for strategy and execution</w:t>
-      </w:r>
-      <w:r>
-        <w:t xml:space="preserve">. Harvard Business Press.</w:t>
-      </w:r>
-    </w:p>
-    <w:p>
-      <w:pPr>
-        <w:pStyle w:val="BodyText"/>
-      </w:pPr>
-      <w:r>
-        <w:t xml:space="preserve">Kirca, A. H., Hult, G. T. M., Roth, K., Cavusgil, S. T., Perry, M. Z., Akdeniz, M. B., Deligonul, S. Z., Mena, J. A., Pollitte, W. A., Hoppner, J. J., Miller, J. C., &amp; White, R. C. (2011). Firm-specific assets, multinationality, and financial performance: A meta-analytic review and theoretical integration.</w:t>
-      </w:r>
-      <w:r>
-        <w:t xml:space="preserve"> </w:t>
-      </w:r>
-      <w:r>
-        <w:rPr>
-          <w:iCs/>
-          <w:i/>
-        </w:rPr>
-        <w:t xml:space="preserve">Academy of Management Journal, 54</w:t>
-      </w:r>
-      <w:r>
-        <w:t xml:space="preserve">(1), 47–72. https://doi.org/10.5465/amj.2011.59215090</w:t>
-      </w:r>
-    </w:p>
-    <w:p>
-      <w:pPr>
-        <w:pStyle w:val="BodyText"/>
-      </w:pPr>
-      <w:r>
-        <w:t xml:space="preserve">Lall, S. (1992). Technological capabilities and industrialization.</w:t>
-      </w:r>
-      <w:r>
-        <w:t xml:space="preserve"> </w:t>
-      </w:r>
-      <w:r>
-        <w:rPr>
-          <w:iCs/>
-          <w:i/>
-        </w:rPr>
-        <w:t xml:space="preserve">World Development, 20</w:t>
-      </w:r>
-      <w:r>
-        <w:t xml:space="preserve">(2), 165–186. https://doi.org/10.1016/0305-750X(92)90097-F</w:t>
-      </w:r>
-    </w:p>
-    <w:p>
-      <w:pPr>
-        <w:pStyle w:val="BodyText"/>
-      </w:pPr>
-      <w:r>
-        <w:t xml:space="preserve">Lind, J. T., &amp; Mehlum, H. (2010). With or without U? The appropriate test for a U-shaped relationship.</w:t>
-      </w:r>
-      <w:r>
-        <w:t xml:space="preserve"> </w:t>
-      </w:r>
-      <w:r>
-        <w:rPr>
-          <w:iCs/>
-          <w:i/>
-        </w:rPr>
-        <w:t xml:space="preserve">Oxford Bulletin of Economics and Statistics, 72</w:t>
-      </w:r>
-      <w:r>
-        <w:t xml:space="preserve">(1), 109–118. https://doi.org/10.1111/j.1468-0084.2009.00569.x</w:t>
-      </w:r>
-    </w:p>
-    <w:p>
-      <w:pPr>
-        <w:pStyle w:val="BodyText"/>
-      </w:pPr>
-      <w:r>
-        <w:t xml:space="preserve">Lu, J. W., &amp; Beamish, P. W. (2004). International diversification and firm performance: The S-curve hypothesis.</w:t>
-      </w:r>
-      <w:r>
-        <w:t xml:space="preserve"> </w:t>
-      </w:r>
-      <w:r>
-        <w:rPr>
-          <w:iCs/>
-          <w:i/>
-        </w:rPr>
-        <w:t xml:space="preserve">Academy of Management Journal, 47</w:t>
-      </w:r>
-      <w:r>
-        <w:t xml:space="preserve">(4), 598–609. https://doi.org/10.2307/20159604</w:t>
-      </w:r>
-    </w:p>
-    <w:p>
-      <w:pPr>
-        <w:pStyle w:val="BodyText"/>
-      </w:pPr>
-      <w:r>
-        <w:t xml:space="preserve">Mahler, D. G., Serajuddin, U., Wadhwa, D., &amp; Yonzan, N. (2026, April).</w:t>
-      </w:r>
-      <w:r>
-        <w:t xml:space="preserve"> </w:t>
-      </w:r>
-      <w:r>
-        <w:rPr>
-          <w:iCs/>
-          <w:i/>
-        </w:rPr>
-        <w:t xml:space="preserve">The world is developing at its slowest pace in 75 years</w:t>
-      </w:r>
-      <w:r>
-        <w:t xml:space="preserve"> </w:t>
-      </w:r>
-      <w:r>
-        <w:t xml:space="preserve">(Policy Research Working Paper No. 11350). World Bank Group.</w:t>
-      </w:r>
-    </w:p>
-    <w:p>
-      <w:pPr>
-        <w:pStyle w:val="BodyText"/>
-      </w:pPr>
-      <w:r>
-        <w:t xml:space="preserve">Melitz, M. J. (2003). The impact of trade on intra-industry reallocations and aggregate industry productivity.</w:t>
-      </w:r>
-      <w:r>
-        <w:t xml:space="preserve"> </w:t>
-      </w:r>
-      <w:r>
-        <w:rPr>
-          <w:iCs/>
-          <w:i/>
-        </w:rPr>
-        <w:t xml:space="preserve">Econometrica, 71</w:t>
-      </w:r>
-      <w:r>
-        <w:t xml:space="preserve">(6), 1695–1725. https://doi.org/10.1111/1468-0262.00467</w:t>
-      </w:r>
-    </w:p>
-    <w:p>
-      <w:pPr>
-        <w:pStyle w:val="BodyText"/>
-      </w:pPr>
-      <w:r>
-        <w:t xml:space="preserve">North, D. C. (1990).</w:t>
-      </w:r>
-      <w:r>
-        <w:t xml:space="preserve"> </w:t>
-      </w:r>
-      <w:r>
-        <w:rPr>
-          <w:iCs/>
-          <w:i/>
-        </w:rPr>
-        <w:t xml:space="preserve">Institutions, institutional change and economic performance</w:t>
-      </w:r>
-      <w:r>
-        <w:t xml:space="preserve">. Cambridge University Press. https://doi.org/10.1017/CBO9780511808678</w:t>
-      </w:r>
-    </w:p>
-    <w:p>
-      <w:pPr>
-        <w:pStyle w:val="BodyText"/>
-      </w:pPr>
-      <w:r>
-        <w:t xml:space="preserve">Pisani, N., Garcia-Bernardo, J., &amp; Heemskerk, E. (2020). Does it pay to be a multinational? A large-sample, cross-national replication assessing the multinationality–performance relationship.</w:t>
-      </w:r>
-      <w:r>
-        <w:t xml:space="preserve"> </w:t>
-      </w:r>
-      <w:r>
-        <w:rPr>
-          <w:iCs/>
-          <w:i/>
-        </w:rPr>
-        <w:t xml:space="preserve">Strategic Management Journal, 41</w:t>
-      </w:r>
-      <w:r>
-        <w:t xml:space="preserve">(1), 152–172. https://doi.org/10.1002/smj.3087</w:t>
-      </w:r>
-    </w:p>
-    <w:p>
-      <w:pPr>
-        <w:pStyle w:val="BodyText"/>
-      </w:pPr>
-      <w:r>
-        <w:t xml:space="preserve">Sarasvathy, S. D., Kumar, K., York, J. G., &amp; Bhagavatula, S. (2014). An effectual approach to international entrepreneurship: Overlaps, challenges, and provocative possibilities.</w:t>
-      </w:r>
-      <w:r>
-        <w:t xml:space="preserve"> </w:t>
-      </w:r>
-      <w:r>
-        <w:rPr>
-          <w:iCs/>
-          <w:i/>
-        </w:rPr>
-        <w:t xml:space="preserve">Entrepreneurship Theory and Practice, 38</w:t>
-      </w:r>
-      <w:r>
-        <w:t xml:space="preserve">(1), 71–93. https://doi.org/10.1111/etap.12088</w:t>
-      </w:r>
-    </w:p>
-    <w:p>
-      <w:pPr>
-        <w:pStyle w:val="BodyText"/>
-      </w:pPr>
-      <w:r>
-        <w:t xml:space="preserve">Verbeke, A., &amp; Brugman, P. (2018). Triple-testing the quality of multinationality–performance research: An internalization theory perspective.</w:t>
-      </w:r>
-      <w:r>
-        <w:t xml:space="preserve"> </w:t>
-      </w:r>
-      <w:r>
-        <w:rPr>
-          <w:iCs/>
-          <w:i/>
-        </w:rPr>
-        <w:t xml:space="preserve">International Business Review, 27</w:t>
-      </w:r>
-      <w:r>
-        <w:t xml:space="preserve">(2), 333–351. https://doi.org/10.1016/j.ibusrev.2017.09.005</w:t>
-      </w:r>
-    </w:p>
-    <w:p>
-      <w:pPr>
-        <w:pStyle w:val="BodyText"/>
-      </w:pPr>
-      <w:r>
-        <w:t xml:space="preserve">Winters, L. A., &amp; Martins, P. M. G. (2004). When comparative advantage is not enough: Business costs in small remote economies.</w:t>
-      </w:r>
-      <w:r>
-        <w:t xml:space="preserve"> </w:t>
-      </w:r>
-      <w:r>
-        <w:rPr>
-          <w:iCs/>
-          <w:i/>
-        </w:rPr>
-        <w:t xml:space="preserve">World Trade Review, 3</w:t>
-      </w:r>
-      <w:r>
-        <w:t xml:space="preserve">(3), 347–383. https://doi.org/10.1017/S1474745604001922</w:t>
-      </w:r>
-    </w:p>
-    <w:p>
-      <w:pPr>
-        <w:pStyle w:val="BodyText"/>
-      </w:pPr>
-      <w:r>
-        <w:t xml:space="preserve">Zaheer, S. (1995). Overcoming the liability of foreignness.</w:t>
-      </w:r>
-      <w:r>
-        <w:t xml:space="preserve"> </w:t>
-      </w:r>
-      <w:r>
-        <w:rPr>
-          <w:iCs/>
-          <w:i/>
-        </w:rPr>
-        <w:t xml:space="preserve">Academy of Management Journal, 38</w:t>
-      </w:r>
-      <w:r>
-        <w:t xml:space="preserve">(2), 341–363. https://doi.org/10.2307/256683</w:t>
       </w:r>
     </w:p>
     <w:bookmarkEnd w:id="41"/>
     <w:bookmarkEnd w:id="42"/>
+    <w:bookmarkStart w:id="43" w:name="conclusion"/>
+    <w:p>
+      <w:pPr>
+        <w:pStyle w:val="Heading2"/>
+      </w:pPr>
+      <w:r>
+        <w:t xml:space="preserve">6. Conclusion</w:t>
+      </w:r>
+    </w:p>
+    <w:p>
+      <w:pPr>
+        <w:pStyle w:val="FirstParagraph"/>
+      </w:pPr>
+      <w:r>
+        <w:t xml:space="preserve">The inverted-U is the workhorse functional form of the internationalization–performance literature, but its generating logic presupposes structural prerequisites that the world’s most peripheral economies lack. Using firm-level data from eight Pacific island states and Timor-Leste, we show that the inverted-U dissolves at this periphery and, conditional on capability, inverts into a convex penalty across the export-intensity range where island firms actually operate. We name the limiting case the Forced Internationalization Penalty and position it as a scope condition of universal internationalization theory. The paradigm is conditional, not universal: where the domestic market is too small, trade costs too high, and institutions too thin, intensifying internationalization is not a path to performance but a structural burden.</w:t>
+      </w:r>
+    </w:p>
+    <w:bookmarkEnd w:id="43"/>
+    <w:bookmarkStart w:id="44" w:name="references"/>
+    <w:p>
+      <w:pPr>
+        <w:pStyle w:val="Heading2"/>
+      </w:pPr>
+      <w:r>
+        <w:t xml:space="preserve">References</w:t>
+      </w:r>
+    </w:p>
+    <w:p>
+      <w:pPr>
+        <w:pStyle w:val="FirstParagraph"/>
+      </w:pPr>
+      <w:r>
+        <w:t xml:space="preserve">Bausch, A., &amp; Krist, M. (2007). The effect of context-related moderators on the internationalization–performance relationship: Evidence from meta-analysis.</w:t>
+      </w:r>
+      <w:r>
+        <w:t xml:space="preserve"> </w:t>
+      </w:r>
+      <w:r>
+        <w:rPr>
+          <w:iCs/>
+          <w:i/>
+        </w:rPr>
+        <w:t xml:space="preserve">Management International Review, 47</w:t>
+      </w:r>
+      <w:r>
+        <w:t xml:space="preserve">(3), 319–347. https://doi.org/10.1007/s11575-007-0019-z</w:t>
+      </w:r>
+    </w:p>
+    <w:p>
+      <w:pPr>
+        <w:pStyle w:val="BodyText"/>
+      </w:pPr>
+      <w:r>
+        <w:t xml:space="preserve">Berry, H., &amp; Kaul, A. (2016). Replicating the multinationality–performance relationship: Is there an S-curve?</w:t>
+      </w:r>
+      <w:r>
+        <w:t xml:space="preserve"> </w:t>
+      </w:r>
+      <w:r>
+        <w:rPr>
+          <w:iCs/>
+          <w:i/>
+        </w:rPr>
+        <w:t xml:space="preserve">Strategic Management Journal, 37</w:t>
+      </w:r>
+      <w:r>
+        <w:t xml:space="preserve">(11), 2275–2290. https://doi.org/10.1002/smj.2567</w:t>
+      </w:r>
+    </w:p>
+    <w:p>
+      <w:pPr>
+        <w:pStyle w:val="BodyText"/>
+      </w:pPr>
+      <w:r>
+        <w:t xml:space="preserve">Briguglio, L. (1995). Small island developing states and their economic vulnerabilities.</w:t>
+      </w:r>
+      <w:r>
+        <w:t xml:space="preserve"> </w:t>
+      </w:r>
+      <w:r>
+        <w:rPr>
+          <w:iCs/>
+          <w:i/>
+        </w:rPr>
+        <w:t xml:space="preserve">World Development, 23</w:t>
+      </w:r>
+      <w:r>
+        <w:t xml:space="preserve">(9), 1615–1632. https://doi.org/10.1016/0305-750X(95)00065-K</w:t>
+      </w:r>
+    </w:p>
+    <w:p>
+      <w:pPr>
+        <w:pStyle w:val="BodyText"/>
+      </w:pPr>
+      <w:r>
+        <w:t xml:space="preserve">Cameron, A. C., Gelbach, J. B., &amp; Miller, D. L. (2008). Bootstrap-based improvements for inference with clustered errors.</w:t>
+      </w:r>
+      <w:r>
+        <w:t xml:space="preserve"> </w:t>
+      </w:r>
+      <w:r>
+        <w:rPr>
+          <w:iCs/>
+          <w:i/>
+        </w:rPr>
+        <w:t xml:space="preserve">The Review of Economics and Statistics, 90</w:t>
+      </w:r>
+      <w:r>
+        <w:t xml:space="preserve">(3), 414–427. https://doi.org/10.1162/rest.90.3.414</w:t>
+      </w:r>
+    </w:p>
+    <w:p>
+      <w:pPr>
+        <w:pStyle w:val="BodyText"/>
+      </w:pPr>
+      <w:r>
+        <w:t xml:space="preserve">Cohen, W. M., &amp; Levinthal, D. A. (1990). Absorptive capacity: A new perspective on learning and innovation.</w:t>
+      </w:r>
+      <w:r>
+        <w:t xml:space="preserve"> </w:t>
+      </w:r>
+      <w:r>
+        <w:rPr>
+          <w:iCs/>
+          <w:i/>
+        </w:rPr>
+        <w:t xml:space="preserve">Administrative Science Quarterly, 35</w:t>
+      </w:r>
+      <w:r>
+        <w:t xml:space="preserve">(1), 128–152. https://doi.org/10.2307/2393553</w:t>
+      </w:r>
+    </w:p>
+    <w:p>
+      <w:pPr>
+        <w:pStyle w:val="BodyText"/>
+      </w:pPr>
+      <w:r>
+        <w:t xml:space="preserve">Contractor, F. J., Kundu, S. K., &amp; Hsu, C.-C. (2003). A three-stage theory of international expansion: The link between multinationality and performance in the service sector.</w:t>
+      </w:r>
+      <w:r>
+        <w:t xml:space="preserve"> </w:t>
+      </w:r>
+      <w:r>
+        <w:rPr>
+          <w:iCs/>
+          <w:i/>
+        </w:rPr>
+        <w:t xml:space="preserve">Journal of International Business Studies, 34</w:t>
+      </w:r>
+      <w:r>
+        <w:t xml:space="preserve">(1), 5–18. https://doi.org/10.1057/palgrave.jibs.8400003</w:t>
+      </w:r>
+    </w:p>
+    <w:p>
+      <w:pPr>
+        <w:pStyle w:val="BodyText"/>
+      </w:pPr>
+      <w:r>
+        <w:t xml:space="preserve">Diamantopoulos, A., &amp; Winklhofer, H. M. (2001). Index construction with formative indicators: An alternative to scale development.</w:t>
+      </w:r>
+      <w:r>
+        <w:t xml:space="preserve"> </w:t>
+      </w:r>
+      <w:r>
+        <w:rPr>
+          <w:iCs/>
+          <w:i/>
+        </w:rPr>
+        <w:t xml:space="preserve">Journal of Marketing Research, 38</w:t>
+      </w:r>
+      <w:r>
+        <w:t xml:space="preserve">(2), 269–277. https://doi.org/10.1509/jmkr.38.2.269.18845</w:t>
+      </w:r>
+    </w:p>
+    <w:p>
+      <w:pPr>
+        <w:pStyle w:val="BodyText"/>
+      </w:pPr>
+      <w:r>
+        <w:t xml:space="preserve">Doh, J. P., Rodrigues, S., Saka-Helmhout, A., &amp; Makhija, M. (2017). International business responses to institutional voids.</w:t>
+      </w:r>
+      <w:r>
+        <w:t xml:space="preserve"> </w:t>
+      </w:r>
+      <w:r>
+        <w:rPr>
+          <w:iCs/>
+          <w:i/>
+        </w:rPr>
+        <w:t xml:space="preserve">Journal of International Business Studies, 48</w:t>
+      </w:r>
+      <w:r>
+        <w:t xml:space="preserve">(3), 293–307. https://doi.org/10.1057/s41267-017-0074-z</w:t>
+      </w:r>
+    </w:p>
+    <w:p>
+      <w:pPr>
+        <w:pStyle w:val="BodyText"/>
+      </w:pPr>
+      <w:r>
+        <w:t xml:space="preserve">Haans, R. F. J., Pieters, C., &amp; He, Z.-L. (2016). Thinking about U: Theorizing and testing U- and inverted U-shaped relationships in strategy research.</w:t>
+      </w:r>
+      <w:r>
+        <w:t xml:space="preserve"> </w:t>
+      </w:r>
+      <w:r>
+        <w:rPr>
+          <w:iCs/>
+          <w:i/>
+        </w:rPr>
+        <w:t xml:space="preserve">Strategic Management Journal, 37</w:t>
+      </w:r>
+      <w:r>
+        <w:t xml:space="preserve">(7), 1177–1195. https://doi.org/10.1002/smj.2399</w:t>
+      </w:r>
+    </w:p>
+    <w:p>
+      <w:pPr>
+        <w:pStyle w:val="BodyText"/>
+      </w:pPr>
+      <w:r>
+        <w:t xml:space="preserve">Hennart, J.-F. (2007). The theoretical rationale for a multinationality–performance relationship.</w:t>
+      </w:r>
+      <w:r>
+        <w:t xml:space="preserve"> </w:t>
+      </w:r>
+      <w:r>
+        <w:rPr>
+          <w:iCs/>
+          <w:i/>
+        </w:rPr>
+        <w:t xml:space="preserve">Management International Review, 47</w:t>
+      </w:r>
+      <w:r>
+        <w:t xml:space="preserve">(3), 423–452. https://doi.org/10.1007/s11575-007-0023-3</w:t>
+      </w:r>
+    </w:p>
+    <w:p>
+      <w:pPr>
+        <w:pStyle w:val="BodyText"/>
+      </w:pPr>
+      <w:r>
+        <w:t xml:space="preserve">Hitt, M. A., Hoskisson, R. E., &amp; Kim, H. (1997). International diversification: Effects on innovation and firm performance in product-diversified firms.</w:t>
+      </w:r>
+      <w:r>
+        <w:t xml:space="preserve"> </w:t>
+      </w:r>
+      <w:r>
+        <w:rPr>
+          <w:iCs/>
+          <w:i/>
+        </w:rPr>
+        <w:t xml:space="preserve">Academy of Management Journal, 40</w:t>
+      </w:r>
+      <w:r>
+        <w:t xml:space="preserve">(4), 767–798. https://doi.org/10.2307/256948</w:t>
+      </w:r>
+    </w:p>
+    <w:p>
+      <w:pPr>
+        <w:pStyle w:val="BodyText"/>
+      </w:pPr>
+      <w:r>
+        <w:t xml:space="preserve">Hsieh, C.-T., &amp; Klenow, P. J. (2009). Misallocation and manufacturing TFP in China and India.</w:t>
+      </w:r>
+      <w:r>
+        <w:t xml:space="preserve"> </w:t>
+      </w:r>
+      <w:r>
+        <w:rPr>
+          <w:iCs/>
+          <w:i/>
+        </w:rPr>
+        <w:t xml:space="preserve">The Quarterly Journal of Economics, 124</w:t>
+      </w:r>
+      <w:r>
+        <w:t xml:space="preserve">(4), 1403–1448. https://doi.org/10.1162/qjec.2009.124.4.1403</w:t>
+      </w:r>
+    </w:p>
+    <w:p>
+      <w:pPr>
+        <w:pStyle w:val="BodyText"/>
+      </w:pPr>
+      <w:r>
+        <w:t xml:space="preserve">Jarvis, C. B., MacKenzie, S. B., &amp; Podsakoff, P. M. (2003). A critical review of construct indicators and measurement model misspecification in marketing and consumer research.</w:t>
+      </w:r>
+      <w:r>
+        <w:t xml:space="preserve"> </w:t>
+      </w:r>
+      <w:r>
+        <w:rPr>
+          <w:iCs/>
+          <w:i/>
+        </w:rPr>
+        <w:t xml:space="preserve">Journal of Consumer Research, 30</w:t>
+      </w:r>
+      <w:r>
+        <w:t xml:space="preserve">(2), 199–218. https://doi.org/10.1086/376806</w:t>
+      </w:r>
+    </w:p>
+    <w:p>
+      <w:pPr>
+        <w:pStyle w:val="BodyText"/>
+      </w:pPr>
+      <w:r>
+        <w:t xml:space="preserve">Johanson, J., &amp; Vahlne, J.-E. (1977). The internationalization process of the firm: A model of knowledge development and increasing foreign market commitments.</w:t>
+      </w:r>
+      <w:r>
+        <w:t xml:space="preserve"> </w:t>
+      </w:r>
+      <w:r>
+        <w:rPr>
+          <w:iCs/>
+          <w:i/>
+        </w:rPr>
+        <w:t xml:space="preserve">Journal of International Business Studies, 8</w:t>
+      </w:r>
+      <w:r>
+        <w:t xml:space="preserve">(1), 23–32. https://doi.org/10.1057/palgrave.jibs.8490676</w:t>
+      </w:r>
+    </w:p>
+    <w:p>
+      <w:pPr>
+        <w:pStyle w:val="BodyText"/>
+      </w:pPr>
+      <w:r>
+        <w:t xml:space="preserve">Johanson, J., &amp; Vahlne, J.-E. (2009). The Uppsala internationalization process model revisited: From liability of foreignness to liability of outsidership.</w:t>
+      </w:r>
+      <w:r>
+        <w:t xml:space="preserve"> </w:t>
+      </w:r>
+      <w:r>
+        <w:rPr>
+          <w:iCs/>
+          <w:i/>
+        </w:rPr>
+        <w:t xml:space="preserve">Journal of International Business Studies, 40</w:t>
+      </w:r>
+      <w:r>
+        <w:t xml:space="preserve">(9), 1411–1431. https://doi.org/10.1057/jibs.2009.24</w:t>
+      </w:r>
+    </w:p>
+    <w:p>
+      <w:pPr>
+        <w:pStyle w:val="BodyText"/>
+      </w:pPr>
+      <w:r>
+        <w:t xml:space="preserve">Khanna, T., &amp; Palepu, K. G. (2010).</w:t>
+      </w:r>
+      <w:r>
+        <w:t xml:space="preserve"> </w:t>
+      </w:r>
+      <w:r>
+        <w:rPr>
+          <w:iCs/>
+          <w:i/>
+        </w:rPr>
+        <w:t xml:space="preserve">Winning in emerging markets: A road map for strategy and execution</w:t>
+      </w:r>
+      <w:r>
+        <w:t xml:space="preserve">. Harvard Business Press.</w:t>
+      </w:r>
+    </w:p>
+    <w:p>
+      <w:pPr>
+        <w:pStyle w:val="BodyText"/>
+      </w:pPr>
+      <w:r>
+        <w:t xml:space="preserve">Kirca, A. H., Hult, G. T. M., Roth, K., Cavusgil, S. T., Perry, M. Z., Akdeniz, M. B., Deligonul, S. Z., Mena, J. A., Pollitte, W. A., Hoppner, J. J., Miller, J. C., &amp; White, R. C. (2011). Firm-specific assets, multinationality, and financial performance: A meta-analytic review and theoretical integration.</w:t>
+      </w:r>
+      <w:r>
+        <w:t xml:space="preserve"> </w:t>
+      </w:r>
+      <w:r>
+        <w:rPr>
+          <w:iCs/>
+          <w:i/>
+        </w:rPr>
+        <w:t xml:space="preserve">Academy of Management Journal, 54</w:t>
+      </w:r>
+      <w:r>
+        <w:t xml:space="preserve">(1), 47–72. https://doi.org/10.5465/amj.2011.59215090</w:t>
+      </w:r>
+    </w:p>
+    <w:p>
+      <w:pPr>
+        <w:pStyle w:val="BodyText"/>
+      </w:pPr>
+      <w:r>
+        <w:t xml:space="preserve">Lall, S. (1992). Technological capabilities and industrialization.</w:t>
+      </w:r>
+      <w:r>
+        <w:t xml:space="preserve"> </w:t>
+      </w:r>
+      <w:r>
+        <w:rPr>
+          <w:iCs/>
+          <w:i/>
+        </w:rPr>
+        <w:t xml:space="preserve">World Development, 20</w:t>
+      </w:r>
+      <w:r>
+        <w:t xml:space="preserve">(2), 165–186. https://doi.org/10.1016/0305-750X(92)90097-F</w:t>
+      </w:r>
+    </w:p>
+    <w:p>
+      <w:pPr>
+        <w:pStyle w:val="BodyText"/>
+      </w:pPr>
+      <w:r>
+        <w:t xml:space="preserve">Lind, J. T., &amp; Mehlum, H. (2010). With or without U? The appropriate test for a U-shaped relationship.</w:t>
+      </w:r>
+      <w:r>
+        <w:t xml:space="preserve"> </w:t>
+      </w:r>
+      <w:r>
+        <w:rPr>
+          <w:iCs/>
+          <w:i/>
+        </w:rPr>
+        <w:t xml:space="preserve">Oxford Bulletin of Economics and Statistics, 72</w:t>
+      </w:r>
+      <w:r>
+        <w:t xml:space="preserve">(1), 109–118. https://doi.org/10.1111/j.1468-0084.2009.00569.x</w:t>
+      </w:r>
+    </w:p>
+    <w:p>
+      <w:pPr>
+        <w:pStyle w:val="BodyText"/>
+      </w:pPr>
+      <w:r>
+        <w:t xml:space="preserve">Lu, J. W., &amp; Beamish, P. W. (2004). International diversification and firm performance: The S-curve hypothesis.</w:t>
+      </w:r>
+      <w:r>
+        <w:t xml:space="preserve"> </w:t>
+      </w:r>
+      <w:r>
+        <w:rPr>
+          <w:iCs/>
+          <w:i/>
+        </w:rPr>
+        <w:t xml:space="preserve">Academy of Management Journal, 47</w:t>
+      </w:r>
+      <w:r>
+        <w:t xml:space="preserve">(4), 598–609. https://doi.org/10.2307/20159604</w:t>
+      </w:r>
+    </w:p>
+    <w:p>
+      <w:pPr>
+        <w:pStyle w:val="BodyText"/>
+      </w:pPr>
+      <w:r>
+        <w:t xml:space="preserve">Mahler, D. G., Serajuddin, U., Wadhwa, D., &amp; Yonzan, N. (2026, April).</w:t>
+      </w:r>
+      <w:r>
+        <w:t xml:space="preserve"> </w:t>
+      </w:r>
+      <w:r>
+        <w:rPr>
+          <w:iCs/>
+          <w:i/>
+        </w:rPr>
+        <w:t xml:space="preserve">The world is developing at its slowest pace in 75 years</w:t>
+      </w:r>
+      <w:r>
+        <w:t xml:space="preserve"> </w:t>
+      </w:r>
+      <w:r>
+        <w:t xml:space="preserve">(Policy Research Working Paper No. 11350). World Bank Group.</w:t>
+      </w:r>
+    </w:p>
+    <w:p>
+      <w:pPr>
+        <w:pStyle w:val="BodyText"/>
+      </w:pPr>
+      <w:r>
+        <w:t xml:space="preserve">Melitz, M. J. (2003). The impact of trade on intra-industry reallocations and aggregate industry productivity.</w:t>
+      </w:r>
+      <w:r>
+        <w:t xml:space="preserve"> </w:t>
+      </w:r>
+      <w:r>
+        <w:rPr>
+          <w:iCs/>
+          <w:i/>
+        </w:rPr>
+        <w:t xml:space="preserve">Econometrica, 71</w:t>
+      </w:r>
+      <w:r>
+        <w:t xml:space="preserve">(6), 1695–1725. https://doi.org/10.1111/1468-0262.00467</w:t>
+      </w:r>
+    </w:p>
+    <w:p>
+      <w:pPr>
+        <w:pStyle w:val="BodyText"/>
+      </w:pPr>
+      <w:r>
+        <w:t xml:space="preserve">North, D. C. (1990).</w:t>
+      </w:r>
+      <w:r>
+        <w:t xml:space="preserve"> </w:t>
+      </w:r>
+      <w:r>
+        <w:rPr>
+          <w:iCs/>
+          <w:i/>
+        </w:rPr>
+        <w:t xml:space="preserve">Institutions, institutional change and economic performance</w:t>
+      </w:r>
+      <w:r>
+        <w:t xml:space="preserve">. Cambridge University Press. https://doi.org/10.1017/CBO9780511808678</w:t>
+      </w:r>
+    </w:p>
+    <w:p>
+      <w:pPr>
+        <w:pStyle w:val="BodyText"/>
+      </w:pPr>
+      <w:r>
+        <w:t xml:space="preserve">Pisani, N., Garcia-Bernardo, J., &amp; Heemskerk, E. (2020). Does it pay to be a multinational? A large-sample, cross-national replication assessing the multinationality–performance relationship.</w:t>
+      </w:r>
+      <w:r>
+        <w:t xml:space="preserve"> </w:t>
+      </w:r>
+      <w:r>
+        <w:rPr>
+          <w:iCs/>
+          <w:i/>
+        </w:rPr>
+        <w:t xml:space="preserve">Strategic Management Journal, 41</w:t>
+      </w:r>
+      <w:r>
+        <w:t xml:space="preserve">(1), 152–172. https://doi.org/10.1002/smj.3087</w:t>
+      </w:r>
+    </w:p>
+    <w:p>
+      <w:pPr>
+        <w:pStyle w:val="BodyText"/>
+      </w:pPr>
+      <w:r>
+        <w:t xml:space="preserve">Sarasvathy, S. D., Kumar, K., York, J. G., &amp; Bhagavatula, S. (2014). An effectual approach to international entrepreneurship: Overlaps, challenges, and provocative possibilities.</w:t>
+      </w:r>
+      <w:r>
+        <w:t xml:space="preserve"> </w:t>
+      </w:r>
+      <w:r>
+        <w:rPr>
+          <w:iCs/>
+          <w:i/>
+        </w:rPr>
+        <w:t xml:space="preserve">Entrepreneurship Theory and Practice, 38</w:t>
+      </w:r>
+      <w:r>
+        <w:t xml:space="preserve">(1), 71–93. https://doi.org/10.1111/etap.12088</w:t>
+      </w:r>
+    </w:p>
+    <w:p>
+      <w:pPr>
+        <w:pStyle w:val="BodyText"/>
+      </w:pPr>
+      <w:r>
+        <w:t xml:space="preserve">Verbeke, A., &amp; Brugman, P. (2018). Triple-testing the quality of multinationality–performance research: An internalization theory perspective.</w:t>
+      </w:r>
+      <w:r>
+        <w:t xml:space="preserve"> </w:t>
+      </w:r>
+      <w:r>
+        <w:rPr>
+          <w:iCs/>
+          <w:i/>
+        </w:rPr>
+        <w:t xml:space="preserve">International Business Review, 27</w:t>
+      </w:r>
+      <w:r>
+        <w:t xml:space="preserve">(2), 333–351. https://doi.org/10.1016/j.ibusrev.2017.09.005</w:t>
+      </w:r>
+    </w:p>
+    <w:p>
+      <w:pPr>
+        <w:pStyle w:val="BodyText"/>
+      </w:pPr>
+      <w:r>
+        <w:t xml:space="preserve">Winters, L. A., &amp; Martins, P. M. G. (2004). When comparative advantage is not enough: Business costs in small remote economies.</w:t>
+      </w:r>
+      <w:r>
+        <w:t xml:space="preserve"> </w:t>
+      </w:r>
+      <w:r>
+        <w:rPr>
+          <w:iCs/>
+          <w:i/>
+        </w:rPr>
+        <w:t xml:space="preserve">World Trade Review, 3</w:t>
+      </w:r>
+      <w:r>
+        <w:t xml:space="preserve">(3), 347–383. https://doi.org/10.1017/S1474745604001922</w:t>
+      </w:r>
+    </w:p>
+    <w:p>
+      <w:pPr>
+        <w:pStyle w:val="BodyText"/>
+      </w:pPr>
+      <w:r>
+        <w:t xml:space="preserve">Zaheer, S. (1995). Overcoming the liability of foreignness.</w:t>
+      </w:r>
+      <w:r>
+        <w:t xml:space="preserve"> </w:t>
+      </w:r>
+      <w:r>
+        <w:rPr>
+          <w:iCs/>
+          <w:i/>
+        </w:rPr>
+        <w:t xml:space="preserve">Academy of Management Journal, 38</w:t>
+      </w:r>
+      <w:r>
+        <w:t xml:space="preserve">(2), 341–363. https://doi.org/10.2307/256683</w:t>
+      </w:r>
+    </w:p>
+    <w:bookmarkEnd w:id="44"/>
+    <w:bookmarkEnd w:id="45"/>
     <w:sectPr/>
   </w:body>
 </w:document>

</xml_diff>